<commit_message>
Cover letter: keep the .docx as the submission copy
Co-Authored-By: Claude Opus 5 <noreply@anthropic.com>
</commit_message>
<xml_diff>
--- a/paper/submission/Cover-Letter.docx
+++ b/paper/submission/Cover-Letter.docx
@@ -40,13 +40,15 @@
       <w:r>
         <w:t>Please consider the enclosed manuscript, "Molecular Simulation of Doravirine</w:t>
       </w:r>
-    </w:p>
-    <w:p>
+      <w:r>
+        <w:t xml:space="preserve"> </w:t>
+      </w:r>
       <w:r>
         <w:t>Resistance in HIV-1 Reverse Transcriptase," for publication as an Article in the</w:t>
       </w:r>
-    </w:p>
-    <w:p>
+      <w:r>
+        <w:t xml:space="preserve"> </w:t>
+      </w:r>
       <w:r>
         <w:t>Pharmaceutical Modeling section of JCIM.</w:t>
       </w:r>
@@ -56,64 +58,109 @@
       <w:r>
         <w:t>Doravirine is a second-generation non-nucleoside reverse transcriptase inhibitor</w:t>
       </w:r>
-    </w:p>
-    <w:p>
-      <w:r>
-        <w:t>designed to tolerate the substitutions that defeat earlier drugs in its class. It</w:t>
-      </w:r>
-    </w:p>
-    <w:p>
+      <w:r>
+        <w:t xml:space="preserve"> (NNRTI) </w:t>
+      </w:r>
+      <w:r>
+        <w:t xml:space="preserve">designed to tolerate substitutions that </w:t>
+      </w:r>
+      <w:r>
+        <w:t>compromise</w:t>
+      </w:r>
+      <w:r>
+        <w:t xml:space="preserve"> earlier drugs in its class. It</w:t>
+      </w:r>
+      <w:r>
+        <w:t xml:space="preserve"> </w:t>
+      </w:r>
       <w:r>
         <w:t>is now part of the standard of care, but phenotypic susceptibility data exist for</w:t>
       </w:r>
-    </w:p>
-    <w:p>
-      <w:r>
-        <w:t>only a fraction of the genotypes clinicians encounter, which complicates its use</w:t>
-      </w:r>
-    </w:p>
-    <w:p>
-      <w:r>
-        <w:t>in people with pre-existing NNRTI resistance. We asked a question that this gap</w:t>
-      </w:r>
-    </w:p>
-    <w:p>
-      <w:r>
-        <w:t>makes practical rather than academic: do physics-based binding free energy</w:t>
-      </w:r>
-    </w:p>
-    <w:p>
-      <w:r>
-        <w:t>calculations track measured drug susceptibility well enough to help fill it?</w:t>
+      <w:r>
+        <w:t xml:space="preserve"> </w:t>
+      </w:r>
+      <w:r>
+        <w:t>a fraction of the genotypes encounter</w:t>
+      </w:r>
+      <w:r>
+        <w:t>ed in the clinic</w:t>
+      </w:r>
+      <w:r>
+        <w:t>, which complicates its use</w:t>
+      </w:r>
+      <w:r>
+        <w:t xml:space="preserve"> </w:t>
+      </w:r>
+      <w:r>
+        <w:t xml:space="preserve">in people with pre-existing NNRTI resistance. We asked </w:t>
+      </w:r>
+      <w:r>
+        <w:t xml:space="preserve">whether </w:t>
+      </w:r>
+      <w:r>
+        <w:t>physics-based binding free energy</w:t>
+      </w:r>
+      <w:r>
+        <w:t xml:space="preserve"> </w:t>
+      </w:r>
+      <w:r>
+        <w:t xml:space="preserve">calculations </w:t>
+      </w:r>
+      <w:r>
+        <w:t xml:space="preserve"> correlate with</w:t>
+      </w:r>
+      <w:r>
+        <w:t xml:space="preserve"> drug susceptibility </w:t>
+      </w:r>
+      <w:r>
+        <w:t xml:space="preserve">measured </w:t>
+      </w:r>
+      <w:r>
+        <w:rPr>
+          <w:i/>
+          <w:iCs/>
+        </w:rPr>
+        <w:t xml:space="preserve">in vitro </w:t>
+      </w:r>
+      <w:r>
+        <w:t xml:space="preserve">well enough to help fill </w:t>
+      </w:r>
+      <w:r>
+        <w:t>this gap.</w:t>
       </w:r>
     </w:p>
     <w:p/>
     <w:p>
       <w:r>
-        <w:t>To answer it we simulated wild-type reverse transcriptase and 18</w:t>
-      </w:r>
-    </w:p>
-    <w:p>
-      <w:r>
-        <w:t>doravirine-associated genotypes in explicit solvent, three independent 100 ns</w:t>
-      </w:r>
-    </w:p>
-    <w:p>
-      <w:r>
-        <w:t>replicates each, and computed the effect of every substitution on drug binding by</w:t>
-      </w:r>
-    </w:p>
-    <w:p>
+        <w:t xml:space="preserve">To answer </w:t>
+      </w:r>
+      <w:r>
+        <w:t>this question,</w:t>
+      </w:r>
+      <w:r>
+        <w:t xml:space="preserve"> we simulated wild-type reverse transcriptase and 18</w:t>
+      </w:r>
+      <w:r>
+        <w:t xml:space="preserve"> </w:t>
+      </w:r>
+      <w:r>
+        <w:t>doravirine-associated genotypes in explicit solvent and computed the effect of every substitution on drug binding by</w:t>
+      </w:r>
+      <w:r>
+        <w:t xml:space="preserve"> </w:t>
+      </w:r>
       <w:r>
         <w:t>two independent routes — non-equilibrium alchemical free energy perturbation and</w:t>
       </w:r>
-    </w:p>
-    <w:p>
+      <w:r>
+        <w:t xml:space="preserve"> </w:t>
+      </w:r>
       <w:r>
         <w:t>wild-type-referenced MM/GBSA — then compared both against median phenotypic</w:t>
       </w:r>
-    </w:p>
-    <w:p>
+      <w:r>
+        <w:t xml:space="preserve"> </w:t>
+      </w:r>
       <w:r>
         <w:t>fold-changes curated from the Stanford HIV Drug Resistance Database.</w:t>
       </w:r>
@@ -121,160 +168,217 @@
     <w:p/>
     <w:p>
       <w:r>
-        <w:t>Three things make this a fit for *JCIM* rather than a virology journal:</w:t>
+        <w:t>We think this manuscript is suitable for publication in JCIM for the following reasons</w:t>
+      </w:r>
+      <w:r>
+        <w:t>:</w:t>
       </w:r>
     </w:p>
     <w:p/>
     <w:p>
-      <w:r>
-        <w:t>**A matched benchmark, not a case study.** Previous simulation studies of NNRTI</w:t>
-      </w:r>
-    </w:p>
-    <w:p>
-      <w:r>
-        <w:t>resistance examine up to about four substitutions, rarely in combination. Our</w:t>
-      </w:r>
-    </w:p>
-    <w:p>
-      <w:r>
-        <w:t>panel of 18 includes the multi-mutation patterns that dominate clinical doravirine</w:t>
-      </w:r>
-    </w:p>
-    <w:p>
-      <w:r>
-        <w:t>resistance, so the correspondence between a computed quantity and a measured one</w:t>
-      </w:r>
-    </w:p>
-    <w:p>
+      <w:pPr>
+        <w:pStyle w:val="ListParagraph"/>
+        <w:numPr>
+          <w:ilvl w:val="0"/>
+          <w:numId w:val="1"/>
+        </w:numPr>
+      </w:pPr>
+      <w:r>
+        <w:t>Most p</w:t>
+      </w:r>
+      <w:r>
+        <w:t>revious simulation studies of NNRTI</w:t>
+      </w:r>
+      <w:r>
+        <w:t xml:space="preserve"> </w:t>
+      </w:r>
+      <w:r>
+        <w:t xml:space="preserve">resistance examine </w:t>
+      </w:r>
+      <w:r>
+        <w:t xml:space="preserve">handful of single </w:t>
+      </w:r>
+      <w:r>
+        <w:t xml:space="preserve">substitutions, </w:t>
+      </w:r>
+      <w:r>
+        <w:t>and very rarely double mutations</w:t>
+      </w:r>
+      <w:r>
+        <w:t>. Our</w:t>
+      </w:r>
+      <w:r>
+        <w:t xml:space="preserve"> </w:t>
+      </w:r>
+      <w:r>
+        <w:t xml:space="preserve">panel of 18 </w:t>
+      </w:r>
+      <w:r>
+        <w:t xml:space="preserve">genotypes </w:t>
+      </w:r>
+      <w:r>
+        <w:t>includes the multi-mutation patterns that dominate clinical doravirine</w:t>
+      </w:r>
+      <w:r>
+        <w:t xml:space="preserve"> </w:t>
+      </w:r>
+      <w:r>
+        <w:t xml:space="preserve">resistance, so the correspondence between </w:t>
+      </w:r>
+      <w:r>
+        <w:t>computational predictions</w:t>
+      </w:r>
+      <w:r>
+        <w:t xml:space="preserve"> and</w:t>
+      </w:r>
+      <w:r>
+        <w:t xml:space="preserve"> experimental</w:t>
+      </w:r>
+      <w:r>
+        <w:t xml:space="preserve"> </w:t>
+      </w:r>
+      <w:r>
+        <w:t xml:space="preserve">outcomes </w:t>
+      </w:r>
       <w:r>
         <w:t>can be quantified across a dataset rather than illustrated on a favorable</w:t>
       </w:r>
-    </w:p>
-    <w:p>
+      <w:r>
+        <w:t xml:space="preserve"> </w:t>
+      </w:r>
       <w:r>
         <w:t>example.</w:t>
       </w:r>
     </w:p>
     <w:p/>
     <w:p>
-      <w:r>
-        <w:t xml:space="preserve">**A result reported as it came out.** </w:t>
-      </w:r>
+      <w:pPr>
+        <w:pStyle w:val="ListParagraph"/>
+        <w:numPr>
+          <w:ilvl w:val="0"/>
+          <w:numId w:val="1"/>
+        </w:numPr>
+      </w:pPr>
       <w:proofErr w:type="spellStart"/>
       <w:r>
-        <w:t>ΔΔG_bind</w:t>
+        <w:t>ΔΔG</w:t>
+      </w:r>
+      <w:r>
+        <w:rPr>
+          <w:vertAlign w:val="subscript"/>
+        </w:rPr>
+        <w:t>bind</w:t>
       </w:r>
       <w:proofErr w:type="spellEnd"/>
       <w:r>
         <w:t xml:space="preserve"> correlates only weakly with</w:t>
       </w:r>
-    </w:p>
-    <w:p>
+      <w:r>
+        <w:t xml:space="preserve"> </w:t>
+      </w:r>
       <w:r>
         <w:t>log-transformed fold-change (R² = 0.26, p = 0.07 across the 13 genotypes with</w:t>
       </w:r>
-    </w:p>
-    <w:p>
+      <w:r>
+        <w:t xml:space="preserve"> </w:t>
+      </w:r>
       <w:r>
         <w:t>established phenotypes, and more weakly over the full panel), and MM/GBSA</w:t>
       </w:r>
-    </w:p>
-    <w:p>
+      <w:r>
+        <w:t xml:space="preserve"> </w:t>
+      </w:r>
       <w:r>
         <w:t>identifies resistant genotypes but not susceptible ones. We conclude that neither</w:t>
       </w:r>
-    </w:p>
-    <w:p>
-      <w:r>
-        <w:t>method is yet a proxy for in vitro susceptibility testing. A bounded negative</w:t>
-      </w:r>
-    </w:p>
-    <w:p>
-      <w:r>
-        <w:t>result on a clinically important target seems to us more useful than another</w:t>
-      </w:r>
-    </w:p>
-    <w:p>
-      <w:r>
-        <w:t>selected success, and it is the kind of finding a methods journal is the right</w:t>
-      </w:r>
-    </w:p>
-    <w:p>
-      <w:r>
-        <w:t>place to publish.</w:t>
+      <w:r>
+        <w:t xml:space="preserve"> </w:t>
+      </w:r>
+      <w:r>
+        <w:t xml:space="preserve">method is yet a proxy for </w:t>
+      </w:r>
+      <w:r>
+        <w:rPr>
+          <w:i/>
+          <w:iCs/>
+        </w:rPr>
+        <w:t>in vitro</w:t>
+      </w:r>
+      <w:r>
+        <w:t xml:space="preserve"> susceptibility testing</w:t>
+      </w:r>
+      <w:r>
+        <w:t xml:space="preserve"> and hope to inspire the readers of JCIM</w:t>
+      </w:r>
+      <w:r>
+        <w:t xml:space="preserve"> to pick this up as a challenge for improved pharmaceutical modeling.</w:t>
       </w:r>
     </w:p>
     <w:p/>
     <w:p>
-      <w:r>
-        <w:t>**Structural mechanism from the same trajectories.** The simulations rationalize</w:t>
-      </w:r>
-    </w:p>
-    <w:p>
-      <w:r>
-        <w:t>the drug's known resistance profile: the hydrogen bond doravirine accepts from the</w:t>
-      </w:r>
-    </w:p>
-    <w:p>
-      <w:r>
-        <w:t>residue 103 main-chain carbonyl is preserved across all four K103N-containing</w:t>
-      </w:r>
-    </w:p>
-    <w:p>
-      <w:r>
-        <w:t>genotypes even as the side chain at that position moves about 3 Å closer,</w:t>
-      </w:r>
-    </w:p>
-    <w:p>
-      <w:r>
-        <w:t>while substitutions at Val106 displace the drug in opposite directions depending</w:t>
-      </w:r>
-    </w:p>
-    <w:p>
+      <w:pPr>
+        <w:pStyle w:val="ListParagraph"/>
+        <w:numPr>
+          <w:ilvl w:val="0"/>
+          <w:numId w:val="1"/>
+        </w:numPr>
+      </w:pPr>
+      <w:r>
+        <w:t xml:space="preserve">The simulations </w:t>
+      </w:r>
+      <w:r>
+        <w:t xml:space="preserve">shed light on potential structural mechanisms of </w:t>
+      </w:r>
+      <w:proofErr w:type="spellStart"/>
+      <w:r>
+        <w:t>doravirine’s</w:t>
+      </w:r>
+      <w:proofErr w:type="spellEnd"/>
+      <w:r>
+        <w:t xml:space="preserve"> unique</w:t>
+      </w:r>
+      <w:r>
+        <w:t xml:space="preserve"> resistance profile: </w:t>
+      </w:r>
+      <w:r>
+        <w:t xml:space="preserve">(i) </w:t>
+      </w:r>
+      <w:r>
+        <w:t xml:space="preserve">the hydrogen bond </w:t>
+      </w:r>
+      <w:r>
+        <w:t xml:space="preserve">between doravirine and </w:t>
+      </w:r>
+      <w:r>
+        <w:t>residue 103 main-chain carbonyl is preserved across all K103N-containing</w:t>
+      </w:r>
+      <w:r>
+        <w:t xml:space="preserve"> </w:t>
+      </w:r>
+      <w:r>
+        <w:t>genotypes,</w:t>
+      </w:r>
+      <w:r>
+        <w:t xml:space="preserve"> (ii) loss of aromatic stacking in Y188L is observed in the loss of chlorocyanophenyl ring burial </w:t>
+      </w:r>
+      <w:r>
+        <w:lastRenderedPageBreak/>
+        <w:t xml:space="preserve">in the binding pocket, and (iii) </w:t>
+      </w:r>
+      <w:r>
+        <w:t xml:space="preserve">substitutions at </w:t>
+      </w:r>
+      <w:r>
+        <w:t xml:space="preserve">position </w:t>
+      </w:r>
+      <w:r>
+        <w:t>106 displace the drug in opposite directions depending</w:t>
+      </w:r>
+      <w:r>
+        <w:t xml:space="preserve"> </w:t>
+      </w:r>
       <w:r>
         <w:t>on whether the side chain is shortened or enlarged.</w:t>
-      </w:r>
-    </w:p>
-    <w:p/>
-    <w:p>
-      <w:r>
-        <w:t>We note the Journal's exclusion of straightforward docking applications to a</w:t>
-      </w:r>
-    </w:p>
-    <w:p>
-      <w:r>
-        <w:t>single target without experimental validation. This work uses alchemical free</w:t>
-      </w:r>
-    </w:p>
-    <w:p>
-      <w:r>
-        <w:t>energy and end-point methods rather than docking, and every computed value is</w:t>
-      </w:r>
-    </w:p>
-    <w:p>
-      <w:r>
-        <w:t>tested against measured phenotypic data.</w:t>
-      </w:r>
-    </w:p>
-    <w:p/>
-    <w:p>
-      <w:r>
-        <w:t>All code and derived data needed to reproduce every figure and table are openly</w:t>
-      </w:r>
-    </w:p>
-    <w:p>
-      <w:r>
-        <w:t>available at https://github.com/rohitium/nnrti-mechanisms under the MIT license,</w:t>
-      </w:r>
-    </w:p>
-    <w:p>
-      <w:r>
-        <w:t>and per-replicate values for every reported quantity are given in the Supporting</w:t>
-      </w:r>
-    </w:p>
-    <w:p>
-      <w:r>
-        <w:t>Information.</w:t>
       </w:r>
     </w:p>
     <w:p/>
@@ -340,6 +444,103 @@
     </w:sectPr>
   </w:body>
 </w:document>
+</file>
+
+<file path=word/numbering.xml><?xml version="1.0" encoding="utf-8"?>
+<w:numbering xmlns:wpc="http://schemas.microsoft.com/office/word/2010/wordprocessingCanvas" xmlns:cx="http://schemas.microsoft.com/office/drawing/2014/chartex" xmlns:cx1="http://schemas.microsoft.com/office/drawing/2015/9/8/chartex" xmlns:cx2="http://schemas.microsoft.com/office/drawing/2015/10/21/chartex" xmlns:cx3="http://schemas.microsoft.com/office/drawing/2016/5/9/chartex" xmlns:cx4="http://schemas.microsoft.com/office/drawing/2016/5/10/chartex" xmlns:cx5="http://schemas.microsoft.com/office/drawing/2016/5/11/chartex" xmlns:cx6="http://schemas.microsoft.com/office/drawing/2016/5/12/chartex" xmlns:cx7="http://schemas.microsoft.com/office/drawing/2016/5/13/chartex" xmlns:cx8="http://schemas.microsoft.com/office/drawing/2016/5/14/chartex" xmlns:mc="http://schemas.openxmlformats.org/markup-compatibility/2006" xmlns:m="http://schemas.openxmlformats.org/officeDocument/2006/math" xmlns:aink="http://schemas.microsoft.com/office/drawing/2016/ink" xmlns:am3d="http://schemas.microsoft.com/office/drawing/2017/model3d" xmlns:oel="http://schemas.microsoft.com/office/2019/extlst" xmlns:r="http://schemas.openxmlformats.org/officeDocument/2006/relationships" xmlns:wp14="http://schemas.microsoft.com/office/word/2010/wordprocessingDrawing" xmlns:wp="http://schemas.openxmlformats.org/drawingml/2006/wordprocessingDrawing" xmlns:wpg="http://schemas.microsoft.com/office/word/2010/wordprocessingGroup" xmlns:wpi="http://schemas.microsoft.com/office/word/2010/wordprocessingInk" xmlns:wps="http://schemas.microsoft.com/office/word/2010/wordprocessingShape" xmlns:o="urn:schemas-microsoft-com:office:office" xmlns:v="urn:schemas-microsoft-com:vml" xmlns:w10="urn:schemas-microsoft-com:office:word" xmlns:w="http://schemas.openxmlformats.org/wordprocessingml/2006/main" xmlns:w14="http://schemas.microsoft.com/office/word/2010/wordml" xmlns:w15="http://schemas.microsoft.com/office/word/2012/wordml" xmlns:w16cex="http://schemas.microsoft.com/office/word/2018/wordml/cex" xmlns:w16cid="http://schemas.microsoft.com/office/word/2016/wordml/cid" xmlns:w16="http://schemas.microsoft.com/office/word/2018/wordml" xmlns:w16sdtdh="http://schemas.microsoft.com/office/word/2020/wordml/sdtdatahash" xmlns:w16sdtfl="http://schemas.microsoft.com/office/word/2024/wordml/sdtformatlock" xmlns:w16se="http://schemas.microsoft.com/office/word/2015/wordml/symex" xmlns:w16du="http://schemas.microsoft.com/office/word/2023/wordml/word16du" xmlns:wne="http://schemas.microsoft.com/office/word/2006/wordml" mc:Ignorable="w14 w15 w16se w16cid w16 w16cex w16sdtdh w16sdtfl w16du wp14">
+  <w:abstractNum w:abstractNumId="0" w15:restartNumberingAfterBreak="0">
+    <w:nsid w:val="3A8B31D4"/>
+    <w:multiLevelType w:val="hybridMultilevel"/>
+    <w:tmpl w:val="272413AA"/>
+    <w:lvl w:ilvl="0" w:tplc="0409000F">
+      <w:start w:val="1"/>
+      <w:numFmt w:val="decimal"/>
+      <w:lvlText w:val="%1."/>
+      <w:lvlJc w:val="left"/>
+      <w:pPr>
+        <w:ind w:left="720" w:hanging="360"/>
+      </w:pPr>
+      <w:rPr>
+        <w:rFonts w:hint="default"/>
+      </w:rPr>
+    </w:lvl>
+    <w:lvl w:ilvl="1" w:tplc="04090019" w:tentative="1">
+      <w:start w:val="1"/>
+      <w:numFmt w:val="lowerLetter"/>
+      <w:lvlText w:val="%2."/>
+      <w:lvlJc w:val="left"/>
+      <w:pPr>
+        <w:ind w:left="1440" w:hanging="360"/>
+      </w:pPr>
+    </w:lvl>
+    <w:lvl w:ilvl="2" w:tplc="0409001B" w:tentative="1">
+      <w:start w:val="1"/>
+      <w:numFmt w:val="lowerRoman"/>
+      <w:lvlText w:val="%3."/>
+      <w:lvlJc w:val="right"/>
+      <w:pPr>
+        <w:ind w:left="2160" w:hanging="180"/>
+      </w:pPr>
+    </w:lvl>
+    <w:lvl w:ilvl="3" w:tplc="0409000F" w:tentative="1">
+      <w:start w:val="1"/>
+      <w:numFmt w:val="decimal"/>
+      <w:lvlText w:val="%4."/>
+      <w:lvlJc w:val="left"/>
+      <w:pPr>
+        <w:ind w:left="2880" w:hanging="360"/>
+      </w:pPr>
+    </w:lvl>
+    <w:lvl w:ilvl="4" w:tplc="04090019" w:tentative="1">
+      <w:start w:val="1"/>
+      <w:numFmt w:val="lowerLetter"/>
+      <w:lvlText w:val="%5."/>
+      <w:lvlJc w:val="left"/>
+      <w:pPr>
+        <w:ind w:left="3600" w:hanging="360"/>
+      </w:pPr>
+    </w:lvl>
+    <w:lvl w:ilvl="5" w:tplc="0409001B" w:tentative="1">
+      <w:start w:val="1"/>
+      <w:numFmt w:val="lowerRoman"/>
+      <w:lvlText w:val="%6."/>
+      <w:lvlJc w:val="right"/>
+      <w:pPr>
+        <w:ind w:left="4320" w:hanging="180"/>
+      </w:pPr>
+    </w:lvl>
+    <w:lvl w:ilvl="6" w:tplc="0409000F" w:tentative="1">
+      <w:start w:val="1"/>
+      <w:numFmt w:val="decimal"/>
+      <w:lvlText w:val="%7."/>
+      <w:lvlJc w:val="left"/>
+      <w:pPr>
+        <w:ind w:left="5040" w:hanging="360"/>
+      </w:pPr>
+    </w:lvl>
+    <w:lvl w:ilvl="7" w:tplc="04090019" w:tentative="1">
+      <w:start w:val="1"/>
+      <w:numFmt w:val="lowerLetter"/>
+      <w:lvlText w:val="%8."/>
+      <w:lvlJc w:val="left"/>
+      <w:pPr>
+        <w:ind w:left="5760" w:hanging="360"/>
+      </w:pPr>
+    </w:lvl>
+    <w:lvl w:ilvl="8" w:tplc="0409001B" w:tentative="1">
+      <w:start w:val="1"/>
+      <w:numFmt w:val="lowerRoman"/>
+      <w:lvlText w:val="%9."/>
+      <w:lvlJc w:val="right"/>
+      <w:pPr>
+        <w:ind w:left="6480" w:hanging="180"/>
+      </w:pPr>
+    </w:lvl>
+  </w:abstractNum>
+  <w:num w:numId="1" w16cid:durableId="2097742978">
+    <w:abstractNumId w:val="0"/>
+  </w:num>
+</w:numbering>
 </file>
 
 <file path=word/styles.xml><?xml version="1.0" encoding="utf-8"?>

</xml_diff>

<commit_message>
updated cover letter and manuscript sent to JCIM
</commit_message>
<xml_diff>
--- a/paper/submission/Cover-Letter.docx
+++ b/paper/submission/Cover-Letter.docx
@@ -7,7 +7,7 @@
         <w:t>09-0</w:t>
       </w:r>
       <w:r>
-        <w:t>2</w:t>
+        <w:t>3</w:t>
       </w:r>
       <w:r>
         <w:t>-2026</w:t>
@@ -32,13 +32,7 @@
     <w:p/>
     <w:p>
       <w:r>
-        <w:t>Dear Prof</w:t>
-      </w:r>
-      <w:r>
-        <w:t>essor</w:t>
-      </w:r>
-      <w:r>
-        <w:t xml:space="preserve"> Merz,</w:t>
+        <w:t>Dear Professor Merz,</w:t>
       </w:r>
     </w:p>
     <w:p/>
@@ -253,7 +247,19 @@
         <w:t xml:space="preserve">outcomes </w:t>
       </w:r>
       <w:r>
-        <w:t>can be quantified across a dataset rather than illustrated on a favorable</w:t>
+        <w:t xml:space="preserve">can be quantified across a </w:t>
+      </w:r>
+      <w:r>
+        <w:t xml:space="preserve">clinically useful </w:t>
+      </w:r>
+      <w:r>
+        <w:t>dataset</w:t>
+      </w:r>
+      <w:r>
+        <w:t>,</w:t>
+      </w:r>
+      <w:r>
+        <w:t xml:space="preserve"> rather than illustrated on a favorable</w:t>
       </w:r>
       <w:r>
         <w:t xml:space="preserve"> </w:t>

</xml_diff>